<commit_message>
Update brief explanation of Customer Risk Level customization and server script implementation
</commit_message>
<xml_diff>
--- a/Customization/Brief explanation/Brief explanation.docx
+++ b/Customization/Brief explanation/Brief explanation.docx
@@ -91,22 +91,6 @@
         <w:t>. Instead of writing Python code inside ERPNext's core files, we used the built-in "Server Script" feature which lets you attach logic to system events. We attached our script to the "Before Save" event on the Customer DocType, meaning every time anyone saves a Customer record, our script runs automatically in the background. The script checks the customer's total outstanding invoices from the database in real time, then sets the Risk Level field to Low, Medium, or High based on the amount no manual input needed from the user.</w:t>
       </w:r>
     </w:p>
-    <w:p>
-      <w:r>
-        <w:t xml:space="preserve">The reason this approach is good practice is that both customizations live completely outside the core ERPNext code. Nothing was hacked, nothing was hardcoded into system files. If the company upgrades ERPNext tomorrow, both the custom field and the server script stay intact and keep working. This is called a </w:t>
-      </w:r>
-      <w:r>
-        <w:rPr>
-          <w:b/>
-          <w:bCs/>
-        </w:rPr>
-        <w:t>modular customization</w:t>
-      </w:r>
-      <w:r>
-        <w:t xml:space="preserve"> it plugs in cleanly and can be removed or modified without affecting anything else in the system.</w:t>
-      </w:r>
-    </w:p>
-    <w:p/>
     <w:sectPr>
       <w:pgSz w:w="12240" w:h="15840"/>
       <w:pgMar w:top="1440" w:right="1440" w:bottom="1440" w:left="1440" w:header="720" w:footer="720" w:gutter="0"/>
@@ -720,6 +704,7 @@
   <w:style w:type="character" w:default="1" w:styleId="DefaultParagraphFont">
     <w:name w:val="Default Paragraph Font"/>
     <w:uiPriority w:val="1"/>
+    <w:semiHidden/>
     <w:unhideWhenUsed/>
   </w:style>
   <w:style w:type="table" w:default="1" w:styleId="TableNormal">

</xml_diff>